<commit_message>
update docx and add training loop md
</commit_message>
<xml_diff>
--- a/docs/Agentic_Workflows_wtith_RL_Loop.docx
+++ b/docs/Agentic_Workflows_wtith_RL_Loop.docx
@@ -24,6 +24,9 @@
     <w:p/>
     <w:p/>
     <w:p>
+      <w:pPr>
+        <w:pStyle w:val="Heading1"/>
+      </w:pPr>
       <w:r>
         <w:t>System Flowchart</w:t>
       </w:r>
@@ -78,7 +81,14 @@
       </w:r>
     </w:p>
     <w:p/>
-    <w:p/>
+    <w:p>
+      <w:pPr>
+        <w:pStyle w:val="Heading2"/>
+      </w:pPr>
+      <w:r>
+        <w:t xml:space="preserve">Training Loop </w:t>
+      </w:r>
+    </w:p>
     <w:p/>
     <w:p/>
     <w:p/>
@@ -548,7 +558,6 @@
     <w:next w:val="Normal"/>
     <w:link w:val="Heading2Char"/>
     <w:uiPriority w:val="9"/>
-    <w:semiHidden/>
     <w:unhideWhenUsed/>
     <w:qFormat/>
     <w:rsid w:val="007B451F"/>
@@ -762,7 +771,6 @@
     <w:basedOn w:val="DefaultParagraphFont"/>
     <w:link w:val="Heading2"/>
     <w:uiPriority w:val="9"/>
-    <w:semiHidden/>
     <w:rsid w:val="007B451F"/>
     <w:rPr>
       <w:rFonts w:ascii="Calibri Light" w:eastAsiaTheme="majorEastAsia" w:hAnsi="Calibri Light" w:cstheme="majorBidi"/>

</xml_diff>

<commit_message>
update docx and add md
</commit_message>
<xml_diff>
--- a/docs/Agentic_Workflows_wtith_RL_Loop.docx
+++ b/docs/Agentic_Workflows_wtith_RL_Loop.docx
@@ -1526,7 +1526,7 @@
           </mc:Choice>
           <mc:Fallback>
             <w:pict>
-              <v:shape w14:anchorId="28CE2893" id="Freeform 3" o:spid="_x0000_s1026" style="position:absolute;margin-left:71.05pt;margin-top:3.35pt;width:110.75pt;height:26pt;z-index:251665408;visibility:visible;mso-wrap-style:square;mso-wrap-distance-left:9pt;mso-wrap-distance-top:0;mso-wrap-distance-right:9pt;mso-wrap-distance-bottom:0;mso-position-horizontal:absolute;mso-position-horizontal-relative:text;mso-position-vertical:absolute;mso-position-vertical-relative:text;v-text-anchor:middle" coordsize="1406771,330481" o:gfxdata="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" path="m,324504c6474,267230,12949,209956,65741,163140,118533,116324,217145,70504,316753,43610,416361,16716,560792,6755,663388,1775v102596,-4980,183278,996,268941,11953c1017992,24685,1117600,48591,1177365,67516v59765,18925,79686,35859,113553,59765c1324785,151187,1361640,183061,1380565,210951v18925,27890,23906,83671,23906,83671c1408455,314544,1406463,322512,1404471,330481e" filled="f" strokecolor="#030e13 [484]" strokeweight="1pt">
+              <v:shape w14:anchorId="3C12122E" id="Freeform 3" o:spid="_x0000_s1026" style="position:absolute;margin-left:71.05pt;margin-top:3.35pt;width:110.75pt;height:26pt;z-index:251665408;visibility:visible;mso-wrap-style:square;mso-wrap-distance-left:9pt;mso-wrap-distance-top:0;mso-wrap-distance-right:9pt;mso-wrap-distance-bottom:0;mso-position-horizontal:absolute;mso-position-horizontal-relative:text;mso-position-vertical:absolute;mso-position-vertical-relative:text;v-text-anchor:middle" coordsize="1406771,330481" o:gfxdata="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" path="m,324504c6474,267230,12949,209956,65741,163140,118533,116324,217145,70504,316753,43610,416361,16716,560792,6755,663388,1775v102596,-4980,183278,996,268941,11953c1017992,24685,1117600,48591,1177365,67516v59765,18925,79686,35859,113553,59765c1324785,151187,1361640,183061,1380565,210951v18925,27890,23906,83671,23906,83671c1408455,314544,1406463,322512,1404471,330481e" filled="f" strokecolor="#030e13 [484]" strokeweight="1pt">
                 <v:stroke endarrow="block" endarrowwidth="narrow" endarrowlength="short" joinstyle="miter"/>
                 <v:path arrowok="t" o:connecttype="custom" o:connectlocs="0,324504;65741,163140;316753,43610;663388,1775;932329,13728;1177365,67516;1290918,127281;1380565,210951;1404471,294622;1404471,330481" o:connectangles="0,0,0,0,0,0,0,0,0,0"/>
               </v:shape>
@@ -1967,7 +1967,7 @@
           </mc:Choice>
           <mc:Fallback>
             <w:pict>
-              <v:shape w14:anchorId="2D0CE4C2" id="Freeform 4" o:spid="_x0000_s1026" style="position:absolute;margin-left:70.45pt;margin-top:3.2pt;width:111.2pt;height:25pt;z-index:251666432;visibility:visible;mso-wrap-style:square;mso-wrap-distance-left:9pt;mso-wrap-distance-top:0;mso-wrap-distance-right:9pt;mso-wrap-distance-bottom:0;mso-position-horizontal:absolute;mso-position-horizontal-relative:text;mso-position-vertical:absolute;mso-position-vertical-relative:text;v-text-anchor:middle" coordsize="1412408,317188" o:gfxdata="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" path="m1412217,v498,46816,996,93632,-11953,125506c1387315,157380,1374366,169333,1334523,191247v-39843,21914,-108573,48808,-173318,65741c1096460,273921,1060601,282886,946052,292847v-114549,9961,-356596,21914,-472141,23906c358366,318745,312546,313765,252781,304800,193016,295835,153174,286871,115323,262965,77472,239059,44600,190251,25675,161365,6750,132479,5754,112557,1770,89647v-3984,-22910,,-65741,,-65741l1770,11953e" filled="f" strokecolor="#030e13 [484]" strokeweight="1pt">
+              <v:shape w14:anchorId="47B1E230" id="Freeform 4" o:spid="_x0000_s1026" style="position:absolute;margin-left:70.45pt;margin-top:3.2pt;width:111.2pt;height:25pt;z-index:251666432;visibility:visible;mso-wrap-style:square;mso-wrap-distance-left:9pt;mso-wrap-distance-top:0;mso-wrap-distance-right:9pt;mso-wrap-distance-bottom:0;mso-position-horizontal:absolute;mso-position-horizontal-relative:text;mso-position-vertical:absolute;mso-position-vertical-relative:text;v-text-anchor:middle" coordsize="1412408,317188" o:gfxdata="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" path="m1412217,v498,46816,996,93632,-11953,125506c1387315,157380,1374366,169333,1334523,191247v-39843,21914,-108573,48808,-173318,65741c1096460,273921,1060601,282886,946052,292847v-114549,9961,-356596,21914,-472141,23906c358366,318745,312546,313765,252781,304800,193016,295835,153174,286871,115323,262965,77472,239059,44600,190251,25675,161365,6750,132479,5754,112557,1770,89647v-3984,-22910,,-65741,,-65741l1770,11953e" filled="f" strokecolor="#030e13 [484]" strokeweight="1pt">
                 <v:stroke endarrow="block" endarrowwidth="narrow" endarrowlength="short" joinstyle="miter"/>
                 <v:path arrowok="t" o:connecttype="custom" o:connectlocs="1412217,0;1400264,125506;1334523,191247;1161205,256988;946052,292847;473911,316753;252781,304800;115323,262965;25675,161365;1770,89647;1770,23906;1770,11953" o:connectangles="0,0,0,0,0,0,0,0,0,0,0,0"/>
               </v:shape>
@@ -4523,21 +4523,34 @@
     <w:p>
       <w:pPr>
         <w:rPr>
+          <w:rFonts w:eastAsiaTheme="minorEastAsia" w:cs="Consolas"/>
+        </w:rPr>
+      </w:pPr>
+      <w:r>
+        <w:rPr>
           <w:rFonts w:eastAsiaTheme="minorEastAsia"/>
         </w:rPr>
-      </w:pPr>
-      <w:r>
+        <w:t xml:space="preserve">Example usage of </w:t>
+      </w:r>
+      <w:r>
+        <w:rPr>
+          <w:rFonts w:ascii="Consolas" w:eastAsiaTheme="minorEastAsia" w:hAnsi="Consolas" w:cs="Consolas"/>
+        </w:rPr>
+        <w:t>nn.Sequential</w:t>
+      </w:r>
+      <w:r>
+        <w:rPr>
+          <w:rFonts w:eastAsiaTheme="minorEastAsia" w:cs="Consolas"/>
+        </w:rPr>
+        <w:t xml:space="preserve"> designed for MNIST-style digit classification (0-9)</w:t>
+      </w:r>
+    </w:p>
+    <w:p>
+      <w:pPr>
         <w:rPr>
           <w:rFonts w:eastAsiaTheme="minorEastAsia"/>
         </w:rPr>
-        <w:t xml:space="preserve">Example usage of </w:t>
-      </w:r>
-      <w:r>
-        <w:rPr>
-          <w:rFonts w:ascii="Consolas" w:eastAsiaTheme="minorEastAsia" w:hAnsi="Consolas" w:cs="Consolas"/>
-        </w:rPr>
-        <w:t>nn.Sequential</w:t>
-      </w:r>
+      </w:pPr>
     </w:p>
     <w:p>
       <w:pPr>
@@ -5533,16 +5546,489 @@
     <w:p>
       <w:r>
         <w:lastRenderedPageBreak/>
-        <w:t>Information Flow with Dimensions and Computation Graph shown below:</w:t>
-      </w:r>
-    </w:p>
-    <w:p/>
-    <w:p/>
-    <w:p/>
-    <w:p/>
-    <w:p/>
-    <w:p/>
-    <w:p/>
+        <w:t>Information Flow with Dimensions shown below:</w:t>
+      </w:r>
+    </w:p>
+    <w:p/>
+    <w:p/>
+    <w:p>
+      <w:r>
+        <w:rPr>
+          <w:noProof/>
+        </w:rPr>
+        <w:drawing>
+          <wp:anchor distT="0" distB="0" distL="114300" distR="114300" simplePos="0" relativeHeight="251677696" behindDoc="0" locked="0" layoutInCell="1" allowOverlap="1" wp14:anchorId="6C4D2193" wp14:editId="003885FF">
+            <wp:simplePos x="0" y="0"/>
+            <wp:positionH relativeFrom="column">
+              <wp:posOffset>0</wp:posOffset>
+            </wp:positionH>
+            <wp:positionV relativeFrom="paragraph">
+              <wp:posOffset>1905</wp:posOffset>
+            </wp:positionV>
+            <wp:extent cx="5943600" cy="3153410"/>
+            <wp:effectExtent l="0" t="0" r="0" b="0"/>
+            <wp:wrapTopAndBottom/>
+            <wp:docPr id="1726092145" name="Picture 8" descr="A diagram of a function&#10;&#10;AI-generated content may be incorrect."/>
+            <wp:cNvGraphicFramePr>
+              <a:graphicFrameLocks xmlns:a="http://schemas.openxmlformats.org/drawingml/2006/main" noChangeAspect="1"/>
+            </wp:cNvGraphicFramePr>
+            <a:graphic xmlns:a="http://schemas.openxmlformats.org/drawingml/2006/main">
+              <a:graphicData uri="http://schemas.openxmlformats.org/drawingml/2006/picture">
+                <pic:pic xmlns:pic="http://schemas.openxmlformats.org/drawingml/2006/picture">
+                  <pic:nvPicPr>
+                    <pic:cNvPr id="1726092145" name="Picture 8" descr="A diagram of a function&#10;&#10;AI-generated content may be incorrect."/>
+                    <pic:cNvPicPr/>
+                  </pic:nvPicPr>
+                  <pic:blipFill>
+                    <a:blip r:embed="rId35" cstate="print">
+                      <a:extLst>
+                        <a:ext uri="{28A0092B-C50C-407E-A947-70E740481C1C}">
+                          <a14:useLocalDpi xmlns:a14="http://schemas.microsoft.com/office/drawing/2010/main" val="0"/>
+                        </a:ext>
+                      </a:extLst>
+                    </a:blip>
+                    <a:stretch>
+                      <a:fillRect/>
+                    </a:stretch>
+                  </pic:blipFill>
+                  <pic:spPr>
+                    <a:xfrm>
+                      <a:off x="0" y="0"/>
+                      <a:ext cx="5943600" cy="3153410"/>
+                    </a:xfrm>
+                    <a:prstGeom prst="rect">
+                      <a:avLst/>
+                    </a:prstGeom>
+                  </pic:spPr>
+                </pic:pic>
+              </a:graphicData>
+            </a:graphic>
+            <wp14:sizeRelH relativeFrom="page">
+              <wp14:pctWidth>0</wp14:pctWidth>
+            </wp14:sizeRelH>
+            <wp14:sizeRelV relativeFrom="page">
+              <wp14:pctHeight>0</wp14:pctHeight>
+            </wp14:sizeRelV>
+          </wp:anchor>
+        </w:drawing>
+      </w:r>
+    </w:p>
+    <w:p/>
+    <w:p>
+      <w:r>
+        <w:rPr>
+          <w:noProof/>
+        </w:rPr>
+        <w:drawing>
+          <wp:anchor distT="0" distB="0" distL="114300" distR="114300" simplePos="0" relativeHeight="251679744" behindDoc="0" locked="0" layoutInCell="1" allowOverlap="1" wp14:anchorId="2EA39671" wp14:editId="266EB593">
+            <wp:simplePos x="0" y="0"/>
+            <wp:positionH relativeFrom="column">
+              <wp:posOffset>-59300</wp:posOffset>
+            </wp:positionH>
+            <wp:positionV relativeFrom="paragraph">
+              <wp:posOffset>241259</wp:posOffset>
+            </wp:positionV>
+            <wp:extent cx="2880360" cy="3977640"/>
+            <wp:effectExtent l="0" t="0" r="2540" b="0"/>
+            <wp:wrapTopAndBottom/>
+            <wp:docPr id="914421308" name="Picture 9" descr="A screenshot of a computer&#10;&#10;AI-generated content may be incorrect."/>
+            <wp:cNvGraphicFramePr>
+              <a:graphicFrameLocks xmlns:a="http://schemas.openxmlformats.org/drawingml/2006/main" noChangeAspect="1"/>
+            </wp:cNvGraphicFramePr>
+            <a:graphic xmlns:a="http://schemas.openxmlformats.org/drawingml/2006/main">
+              <a:graphicData uri="http://schemas.openxmlformats.org/drawingml/2006/picture">
+                <pic:pic xmlns:pic="http://schemas.openxmlformats.org/drawingml/2006/picture">
+                  <pic:nvPicPr>
+                    <pic:cNvPr id="914421308" name="Picture 9" descr="A screenshot of a computer&#10;&#10;AI-generated content may be incorrect."/>
+                    <pic:cNvPicPr/>
+                  </pic:nvPicPr>
+                  <pic:blipFill>
+                    <a:blip r:embed="rId36" cstate="print">
+                      <a:extLst>
+                        <a:ext uri="{28A0092B-C50C-407E-A947-70E740481C1C}">
+                          <a14:useLocalDpi xmlns:a14="http://schemas.microsoft.com/office/drawing/2010/main" val="0"/>
+                        </a:ext>
+                      </a:extLst>
+                    </a:blip>
+                    <a:stretch>
+                      <a:fillRect/>
+                    </a:stretch>
+                  </pic:blipFill>
+                  <pic:spPr>
+                    <a:xfrm>
+                      <a:off x="0" y="0"/>
+                      <a:ext cx="2880360" cy="3977640"/>
+                    </a:xfrm>
+                    <a:prstGeom prst="rect">
+                      <a:avLst/>
+                    </a:prstGeom>
+                  </pic:spPr>
+                </pic:pic>
+              </a:graphicData>
+            </a:graphic>
+            <wp14:sizeRelH relativeFrom="page">
+              <wp14:pctWidth>0</wp14:pctWidth>
+            </wp14:sizeRelH>
+            <wp14:sizeRelV relativeFrom="page">
+              <wp14:pctHeight>0</wp14:pctHeight>
+            </wp14:sizeRelV>
+          </wp:anchor>
+        </w:drawing>
+      </w:r>
+      <w:r>
+        <w:t>Computation Graph shown below:</w:t>
+      </w:r>
+    </w:p>
+    <w:p/>
+    <w:p/>
+    <w:p>
+      <w:r>
+        <w:t>Summary Table</w:t>
+      </w:r>
+    </w:p>
+    <w:p>
+      <w:r>
+        <w:rPr>
+          <w:noProof/>
+        </w:rPr>
+        <w:drawing>
+          <wp:anchor distT="0" distB="0" distL="114300" distR="114300" simplePos="0" relativeHeight="251680768" behindDoc="0" locked="0" layoutInCell="1" allowOverlap="1" wp14:anchorId="3B799890" wp14:editId="2BB64DF0">
+            <wp:simplePos x="0" y="0"/>
+            <wp:positionH relativeFrom="column">
+              <wp:posOffset>0</wp:posOffset>
+            </wp:positionH>
+            <wp:positionV relativeFrom="paragraph">
+              <wp:posOffset>172085</wp:posOffset>
+            </wp:positionV>
+            <wp:extent cx="3964305" cy="1903730"/>
+            <wp:effectExtent l="0" t="0" r="0" b="1270"/>
+            <wp:wrapTopAndBottom/>
+            <wp:docPr id="632244737" name="Picture 10" descr="A screenshot of a graph&#10;&#10;AI-generated content may be incorrect."/>
+            <wp:cNvGraphicFramePr>
+              <a:graphicFrameLocks xmlns:a="http://schemas.openxmlformats.org/drawingml/2006/main" noChangeAspect="1"/>
+            </wp:cNvGraphicFramePr>
+            <a:graphic xmlns:a="http://schemas.openxmlformats.org/drawingml/2006/main">
+              <a:graphicData uri="http://schemas.openxmlformats.org/drawingml/2006/picture">
+                <pic:pic xmlns:pic="http://schemas.openxmlformats.org/drawingml/2006/picture">
+                  <pic:nvPicPr>
+                    <pic:cNvPr id="632244737" name="Picture 10" descr="A screenshot of a graph&#10;&#10;AI-generated content may be incorrect."/>
+                    <pic:cNvPicPr/>
+                  </pic:nvPicPr>
+                  <pic:blipFill>
+                    <a:blip r:embed="rId37" cstate="print">
+                      <a:extLst>
+                        <a:ext uri="{28A0092B-C50C-407E-A947-70E740481C1C}">
+                          <a14:useLocalDpi xmlns:a14="http://schemas.microsoft.com/office/drawing/2010/main" val="0"/>
+                        </a:ext>
+                      </a:extLst>
+                    </a:blip>
+                    <a:stretch>
+                      <a:fillRect/>
+                    </a:stretch>
+                  </pic:blipFill>
+                  <pic:spPr>
+                    <a:xfrm>
+                      <a:off x="0" y="0"/>
+                      <a:ext cx="3964305" cy="1903730"/>
+                    </a:xfrm>
+                    <a:prstGeom prst="rect">
+                      <a:avLst/>
+                    </a:prstGeom>
+                  </pic:spPr>
+                </pic:pic>
+              </a:graphicData>
+            </a:graphic>
+            <wp14:sizeRelH relativeFrom="page">
+              <wp14:pctWidth>0</wp14:pctWidth>
+            </wp14:sizeRelH>
+            <wp14:sizeRelV relativeFrom="page">
+              <wp14:pctHeight>0</wp14:pctHeight>
+            </wp14:sizeRelV>
+          </wp:anchor>
+        </w:drawing>
+      </w:r>
+    </w:p>
+    <w:p/>
+    <w:p/>
+    <w:p>
+      <w:r>
+        <w:t>Equations for the Example Network</w:t>
+      </w:r>
+    </w:p>
+    <w:p/>
+    <w:p>
+      <w:r>
+        <w:t>Layer 2 (First linear)</w:t>
+      </w:r>
+    </w:p>
+    <w:p/>
+    <w:p>
+      <m:oMath>
+        <m:sSub>
+          <m:sSubPr>
+            <m:ctrlPr>
+              <w:rPr>
+                <w:rFonts w:ascii="Cambria Math" w:hAnsi="Cambria Math"/>
+                <w:i/>
+              </w:rPr>
+            </m:ctrlPr>
+          </m:sSubPr>
+          <m:e>
+            <m:r>
+              <w:rPr>
+                <w:rFonts w:ascii="Cambria Math" w:hAnsi="Cambria Math"/>
+              </w:rPr>
+              <m:t>z</m:t>
+            </m:r>
+          </m:e>
+          <m:sub>
+            <m:r>
+              <w:rPr>
+                <w:rFonts w:ascii="Cambria Math" w:hAnsi="Cambria Math"/>
+              </w:rPr>
+              <m:t>1</m:t>
+            </m:r>
+          </m:sub>
+        </m:sSub>
+        <m:r>
+          <w:rPr>
+            <w:rFonts w:ascii="Cambria Math" w:hAnsi="Cambria Math"/>
+          </w:rPr>
+          <m:t>=</m:t>
+        </m:r>
+        <m:sSub>
+          <m:sSubPr>
+            <m:ctrlPr>
+              <w:rPr>
+                <w:rFonts w:ascii="Cambria Math" w:hAnsi="Cambria Math"/>
+                <w:i/>
+              </w:rPr>
+            </m:ctrlPr>
+          </m:sSubPr>
+          <m:e>
+            <m:r>
+              <w:rPr>
+                <w:rFonts w:ascii="Cambria Math" w:hAnsi="Cambria Math"/>
+              </w:rPr>
+              <m:t>W</m:t>
+            </m:r>
+          </m:e>
+          <m:sub>
+            <m:r>
+              <w:rPr>
+                <w:rFonts w:ascii="Cambria Math" w:hAnsi="Cambria Math"/>
+              </w:rPr>
+              <m:t>1</m:t>
+            </m:r>
+          </m:sub>
+        </m:sSub>
+        <m:r>
+          <w:rPr>
+            <w:rFonts w:ascii="Cambria Math" w:hAnsi="Cambria Math"/>
+          </w:rPr>
+          <m:t>∙</m:t>
+        </m:r>
+        <m:sSub>
+          <m:sSubPr>
+            <m:ctrlPr>
+              <w:rPr>
+                <w:rFonts w:ascii="Cambria Math" w:hAnsi="Cambria Math"/>
+                <w:i/>
+              </w:rPr>
+            </m:ctrlPr>
+          </m:sSubPr>
+          <m:e>
+            <m:r>
+              <w:rPr>
+                <w:rFonts w:ascii="Cambria Math" w:hAnsi="Cambria Math"/>
+              </w:rPr>
+              <m:t>x</m:t>
+            </m:r>
+          </m:e>
+          <m:sub>
+            <m:r>
+              <w:rPr>
+                <w:rFonts w:ascii="Cambria Math" w:hAnsi="Cambria Math"/>
+              </w:rPr>
+              <m:t>flat</m:t>
+            </m:r>
+          </m:sub>
+        </m:sSub>
+        <m:r>
+          <w:rPr>
+            <w:rFonts w:ascii="Cambria Math" w:hAnsi="Cambria Math"/>
+          </w:rPr>
+          <m:t>+</m:t>
+        </m:r>
+        <m:sSub>
+          <m:sSubPr>
+            <m:ctrlPr>
+              <w:rPr>
+                <w:rFonts w:ascii="Cambria Math" w:hAnsi="Cambria Math"/>
+                <w:i/>
+              </w:rPr>
+            </m:ctrlPr>
+          </m:sSubPr>
+          <m:e>
+            <m:r>
+              <w:rPr>
+                <w:rFonts w:ascii="Cambria Math" w:hAnsi="Cambria Math"/>
+              </w:rPr>
+              <m:t>b</m:t>
+            </m:r>
+          </m:e>
+          <m:sub>
+            <m:r>
+              <w:rPr>
+                <w:rFonts w:ascii="Cambria Math" w:hAnsi="Cambria Math"/>
+              </w:rPr>
+              <m:t>1</m:t>
+            </m:r>
+          </m:sub>
+        </m:sSub>
+      </m:oMath>
+      <w:r>
+        <w:rPr>
+          <w:rFonts w:eastAsiaTheme="minorEastAsia"/>
+        </w:rPr>
+        <w:t xml:space="preserve">  where </w:t>
+      </w:r>
+      <w:r>
+        <w:t xml:space="preserve"> </w:t>
+      </w:r>
+      <m:oMath>
+        <m:sSub>
+          <m:sSubPr>
+            <m:ctrlPr>
+              <w:rPr>
+                <w:rFonts w:ascii="Cambria Math" w:hAnsi="Cambria Math"/>
+                <w:i/>
+              </w:rPr>
+            </m:ctrlPr>
+          </m:sSubPr>
+          <m:e>
+            <m:r>
+              <w:rPr>
+                <w:rFonts w:ascii="Cambria Math" w:hAnsi="Cambria Math"/>
+              </w:rPr>
+              <m:t>W</m:t>
+            </m:r>
+          </m:e>
+          <m:sub>
+            <m:r>
+              <w:rPr>
+                <w:rFonts w:ascii="Cambria Math" w:hAnsi="Cambria Math"/>
+              </w:rPr>
+              <m:t>1</m:t>
+            </m:r>
+          </m:sub>
+        </m:sSub>
+        <m:r>
+          <w:rPr>
+            <w:rFonts w:ascii="Cambria Math" w:hAnsi="Cambria Math"/>
+          </w:rPr>
+          <m:t>∈</m:t>
+        </m:r>
+        <m:sSup>
+          <m:sSupPr>
+            <m:ctrlPr>
+              <w:rPr>
+                <w:rFonts w:ascii="Cambria Math" w:hAnsi="Cambria Math"/>
+                <w:i/>
+              </w:rPr>
+            </m:ctrlPr>
+          </m:sSupPr>
+          <m:e>
+            <m:r>
+              <m:rPr>
+                <m:scr m:val="double-struck"/>
+              </m:rPr>
+              <w:rPr>
+                <w:rFonts w:ascii="Cambria Math" w:hAnsi="Cambria Math"/>
+              </w:rPr>
+              <m:t>R</m:t>
+            </m:r>
+          </m:e>
+          <m:sup>
+            <m:r>
+              <w:rPr>
+                <w:rFonts w:ascii="Cambria Math" w:hAnsi="Cambria Math"/>
+              </w:rPr>
+              <m:t>128×784</m:t>
+            </m:r>
+          </m:sup>
+        </m:sSup>
+      </m:oMath>
+      <w:r>
+        <w:rPr>
+          <w:rFonts w:eastAsiaTheme="minorEastAsia"/>
+        </w:rPr>
+        <w:t xml:space="preserve">, </w:t>
+      </w:r>
+      <m:oMath>
+        <m:sSub>
+          <m:sSubPr>
+            <m:ctrlPr>
+              <w:rPr>
+                <w:rFonts w:ascii="Cambria Math" w:hAnsi="Cambria Math"/>
+                <w:i/>
+              </w:rPr>
+            </m:ctrlPr>
+          </m:sSubPr>
+          <m:e>
+            <m:r>
+              <w:rPr>
+                <w:rFonts w:ascii="Cambria Math" w:hAnsi="Cambria Math"/>
+              </w:rPr>
+              <m:t>b</m:t>
+            </m:r>
+          </m:e>
+          <m:sub>
+            <m:r>
+              <w:rPr>
+                <w:rFonts w:ascii="Cambria Math" w:hAnsi="Cambria Math"/>
+              </w:rPr>
+              <m:t>1</m:t>
+            </m:r>
+          </m:sub>
+        </m:sSub>
+        <m:r>
+          <w:rPr>
+            <w:rFonts w:ascii="Cambria Math" w:hAnsi="Cambria Math"/>
+          </w:rPr>
+          <m:t>∈</m:t>
+        </m:r>
+        <m:sSup>
+          <m:sSupPr>
+            <m:ctrlPr>
+              <w:rPr>
+                <w:rFonts w:ascii="Cambria Math" w:hAnsi="Cambria Math"/>
+                <w:i/>
+              </w:rPr>
+            </m:ctrlPr>
+          </m:sSupPr>
+          <m:e>
+            <m:r>
+              <m:rPr>
+                <m:scr m:val="double-struck"/>
+              </m:rPr>
+              <w:rPr>
+                <w:rFonts w:ascii="Cambria Math" w:hAnsi="Cambria Math"/>
+              </w:rPr>
+              <m:t>R</m:t>
+            </m:r>
+          </m:e>
+          <m:sup>
+            <m:r>
+              <w:rPr>
+                <w:rFonts w:ascii="Cambria Math" w:hAnsi="Cambria Math"/>
+              </w:rPr>
+              <m:t>128</m:t>
+            </m:r>
+          </m:sup>
+        </m:sSup>
+      </m:oMath>
+    </w:p>
     <w:p/>
     <w:p/>
     <w:p/>
@@ -5551,7 +6037,7 @@
       <w:r>
         <w:t xml:space="preserve">For more details see </w:t>
       </w:r>
-      <w:hyperlink r:id="rId35" w:history="1">
+      <w:hyperlink r:id="rId38" w:history="1">
         <w:r>
           <w:rPr>
             <w:rStyle w:val="Hyperlink"/>

</xml_diff>